<commit_message>
Inclui prompt integral no guia e remove links e QR Code
</commit_message>
<xml_diff>
--- a/materiais/entrevista/simulador-editavel.docx
+++ b/materiais/entrevista/simulador-editavel.docx
@@ -26,47 +26,6 @@
     <w:p>
       <w:r>
         <w:t>Copie o prompt abaixo e cole em uma nova conversa no ChatGPT. Responda por voz, se estiver disponível e você quiser, ou por texto. Não compartilhe documentos ou dados de contato. A prática não garante contratação.</w:t>
-      </w:r>
-    </w:p>
-    <w:p>
-      <w:r>
-        <w:t>Página do material: https://github.com/anacarolcardoso96-tech/Ebook/blob/main/materiais/entrevista/README.md</w:t>
-      </w:r>
-    </w:p>
-    <w:p>
-      <w:r>
-        <w:drawing>
-          <wp:inline xmlns:a="http://schemas.openxmlformats.org/drawingml/2006/main" xmlns:pic="http://schemas.openxmlformats.org/drawingml/2006/picture">
-            <wp:extent cx="1440000" cy="1440000"/>
-            <wp:docPr id="1" name="Picture 1"/>
-            <wp:cNvGraphicFramePr>
-              <a:graphicFrameLocks noChangeAspect="1"/>
-            </wp:cNvGraphicFramePr>
-            <a:graphic>
-              <a:graphicData uri="http://schemas.openxmlformats.org/drawingml/2006/picture">
-                <pic:pic>
-                  <pic:nvPicPr>
-                    <pic:cNvPr id="0" name="qr-simulador.png"/>
-                    <pic:cNvPicPr/>
-                  </pic:nvPicPr>
-                  <pic:blipFill>
-                    <a:blip r:embed="rId9"/>
-                    <a:stretch>
-                      <a:fillRect/>
-                    </a:stretch>
-                  </pic:blipFill>
-                  <pic:spPr>
-                    <a:xfrm>
-                      <a:off x="0" y="0"/>
-                      <a:ext cx="1440000" cy="1440000"/>
-                    </a:xfrm>
-                    <a:prstGeom prst="rect"/>
-                  </pic:spPr>
-                </pic:pic>
-              </a:graphicData>
-            </a:graphic>
-          </wp:inline>
-        </w:drawing>
       </w:r>
     </w:p>
     <w:p>

</xml_diff>